<commit_message>
reorders CV to reverse chronilogical
</commit_message>
<xml_diff>
--- a/public/cv/samantha-radocchia-cv.docx
+++ b/public/cv/samantha-radocchia-cv.docx
@@ -224,34 +224,6 @@
           <w:color w:val="0F1F3D"/>
           <w:sz w:val="20"/>
         </w:rPr>
-        <w:t>2017 – present | Sam Rad, Keynote Speaker</w:t>
-      </w:r>
-    </w:p>
-    <w:p>
-      <w:pPr>
-        <w:spacing w:before="0" w:after="40"/>
-      </w:pPr>
-      <w:r>
-        <w:rPr>
-          <w:b w:val="0"/>
-          <w:i w:val="0"/>
-          <w:strike w:val="0"/>
-          <w:color w:val="5B6577"/>
-          <w:sz w:val="19"/>
-        </w:rPr>
-        <w:t>Keynotes on five continents to governments, Fortune 500 companies, trade associations, and international organizations.</w:t>
-      </w:r>
-    </w:p>
-    <w:p>
-      <w:pPr>
-        <w:spacing w:before="140" w:after="20"/>
-      </w:pPr>
-      <w:r>
-        <w:rPr>
-          <w:b/>
-          <w:color w:val="0F1F3D"/>
-          <w:sz w:val="20"/>
-        </w:rPr>
         <w:t>2016 – 2023 | Faculty, Singularity University · Santa Clara, CA</w:t>
       </w:r>
     </w:p>
@@ -365,6 +337,34 @@
           <w:sz w:val="19"/>
         </w:rPr>
         <w:t>Media studio working in narrative futurism. Producer of Illicit Shadows.</w:t>
+      </w:r>
+    </w:p>
+    <w:p>
+      <w:pPr>
+        <w:spacing w:before="140" w:after="20"/>
+      </w:pPr>
+      <w:r>
+        <w:rPr>
+          <w:b/>
+          <w:color w:val="0F1F3D"/>
+          <w:sz w:val="20"/>
+        </w:rPr>
+        <w:t>2017 – present | Sam Rad, Keynote Speaker</w:t>
+      </w:r>
+    </w:p>
+    <w:p>
+      <w:pPr>
+        <w:spacing w:before="0" w:after="40"/>
+      </w:pPr>
+      <w:r>
+        <w:rPr>
+          <w:b w:val="0"/>
+          <w:i w:val="0"/>
+          <w:strike w:val="0"/>
+          <w:color w:val="5B6577"/>
+          <w:sz w:val="19"/>
+        </w:rPr>
+        <w:t>Keynotes on five continents to governments, Fortune 500 companies, trade associations, and international organizations. Represented by Executive Speakers Bureau.</w:t>
       </w:r>
     </w:p>
     <w:p>
@@ -1003,20 +1003,7 @@
           <w:color w:val="0F1F3D"/>
           <w:sz w:val="20"/>
         </w:rPr>
-        <w:t>United Nations | Emerging technology and illicit trade · Working Group on Sustainable Production and Consumption, 2018</w:t>
-      </w:r>
-    </w:p>
-    <w:p>
-      <w:pPr>
-        <w:spacing w:before="140" w:after="20"/>
-      </w:pPr>
-      <w:r>
-        <w:rPr>
-          <w:b/>
-          <w:color w:val="0F1F3D"/>
-          <w:sz w:val="20"/>
-        </w:rPr>
-        <w:t>World Economic Forum | Blockchain and supply chain provenance · Commissioned briefing, 2018</w:t>
+        <w:t>OECD | Counterfeit and illicit market data · Commissioned briefing, March 2026</w:t>
       </w:r>
     </w:p>
     <w:p>
@@ -1042,7 +1029,20 @@
           <w:color w:val="0F1F3D"/>
           <w:sz w:val="20"/>
         </w:rPr>
-        <w:t>OECD | Counterfeit and illicit market data · Commissioned briefing, March 2026</w:t>
+        <w:t>United Nations | Emerging technology and illicit trade · Working Group on Sustainable Production and Consumption, 2018</w:t>
+      </w:r>
+    </w:p>
+    <w:p>
+      <w:pPr>
+        <w:spacing w:before="140" w:after="20"/>
+      </w:pPr>
+      <w:r>
+        <w:rPr>
+          <w:b/>
+          <w:color w:val="0F1F3D"/>
+          <w:sz w:val="20"/>
+        </w:rPr>
+        <w:t>World Economic Forum | Blockchain and supply chain provenance · Commissioned briefing, 2018</w:t>
       </w:r>
     </w:p>
     <w:p>

</xml_diff>